<commit_message>
Ejercicios agregados a word
</commit_message>
<xml_diff>
--- a/GA1_ADS_BWMC.docx
+++ b/GA1_ADS_BWMC.docx
@@ -33,33 +33,18 @@
           <w:color w:val="000000" w:themeColor="text1"/>
           <w:lang w:val="es-MX"/>
         </w:rPr>
-        <w:t xml:space="preserve">1.Ejercicio </w:t>
-      </w:r>
-      <w:proofErr w:type="spellStart"/>
-      <w:r>
-        <w:rPr>
-          <w:color w:val="000000" w:themeColor="text1"/>
-          <w:lang w:val="es-MX"/>
-        </w:rPr>
-        <w:t>numero</w:t>
-      </w:r>
-      <w:proofErr w:type="spellEnd"/>
-      <w:r>
-        <w:rPr>
-          <w:color w:val="000000" w:themeColor="text1"/>
-          <w:lang w:val="es-MX"/>
-        </w:rPr>
-        <w:t xml:space="preserve"> uno en cual se muestran los datos de las variables</w:t>
-      </w:r>
-    </w:p>
-    <w:p>
-      <w:pPr>
-        <w:rPr>
-          <w:lang w:val="es-MX"/>
-        </w:rPr>
-      </w:pPr>
-      <w:r>
-        <w:rPr>
+        <w:t>1.Ejercicio numero uno en cual se muestran los datos de las variables</w:t>
+      </w:r>
+    </w:p>
+    <w:p>
+      <w:pPr>
+        <w:rPr>
+          <w:lang w:val="es-MX"/>
+        </w:rPr>
+      </w:pPr>
+      <w:r>
+        <w:rPr>
+          <w:noProof/>
           <w:lang w:val="es-MX"/>
         </w:rPr>
         <w:drawing>
@@ -100,6 +85,7 @@
       </w:r>
       <w:r>
         <w:rPr>
+          <w:noProof/>
           <w:lang w:val="es-MX"/>
         </w:rPr>
         <w:drawing>
@@ -160,6 +146,7 @@
       </w:pPr>
       <w:r>
         <w:rPr>
+          <w:noProof/>
           <w:lang w:val="es-MX"/>
         </w:rPr>
         <w:drawing>
@@ -207,6 +194,7 @@
       </w:pPr>
       <w:r>
         <w:rPr>
+          <w:noProof/>
           <w:lang w:val="es-MX"/>
         </w:rPr>
         <w:drawing>
@@ -282,6 +270,7 @@
       </w:pPr>
       <w:r>
         <w:rPr>
+          <w:noProof/>
           <w:lang w:val="es-MX"/>
         </w:rPr>
         <w:drawing>
@@ -329,6 +318,7 @@
       </w:pPr>
       <w:r>
         <w:rPr>
+          <w:noProof/>
           <w:lang w:val="es-MX"/>
         </w:rPr>
         <w:drawing>
@@ -389,6 +379,7 @@
       </w:pPr>
       <w:r>
         <w:rPr>
+          <w:noProof/>
           <w:lang w:val="es-MX"/>
         </w:rPr>
         <w:drawing>
@@ -436,6 +427,7 @@
       </w:pPr>
       <w:r>
         <w:rPr>
+          <w:noProof/>
           <w:lang w:val="es-MX"/>
         </w:rPr>
         <w:drawing>
@@ -525,6 +517,7 @@
       </w:pPr>
       <w:r>
         <w:rPr>
+          <w:noProof/>
           <w:lang w:val="es-MX"/>
         </w:rPr>
         <w:drawing>
@@ -572,6 +565,7 @@
       </w:pPr>
       <w:r>
         <w:rPr>
+          <w:noProof/>
           <w:lang w:val="es-MX"/>
         </w:rPr>
         <w:drawing>
@@ -632,6 +626,7 @@
       </w:pPr>
       <w:r>
         <w:rPr>
+          <w:noProof/>
           <w:lang w:val="es-MX"/>
         </w:rPr>
         <w:drawing>
@@ -679,6 +674,7 @@
       </w:pPr>
       <w:r>
         <w:rPr>
+          <w:noProof/>
           <w:lang w:val="es-MX"/>
         </w:rPr>
         <w:drawing>
@@ -768,6 +764,7 @@
       </w:pPr>
       <w:r>
         <w:rPr>
+          <w:noProof/>
           <w:lang w:val="es-MX"/>
         </w:rPr>
         <w:drawing>
@@ -815,6 +812,7 @@
       </w:pPr>
       <w:r>
         <w:rPr>
+          <w:noProof/>
           <w:lang w:val="es-MX"/>
         </w:rPr>
         <w:drawing>
@@ -882,6 +880,7 @@
       </w:pPr>
       <w:r>
         <w:rPr>
+          <w:noProof/>
           <w:lang w:val="es-MX"/>
         </w:rPr>
         <w:drawing>
@@ -929,6 +928,7 @@
       </w:pPr>
       <w:r>
         <w:rPr>
+          <w:noProof/>
           <w:lang w:val="es-MX"/>
         </w:rPr>
         <w:drawing>
@@ -967,6 +967,1207 @@
           </wp:inline>
         </w:drawing>
       </w:r>
+    </w:p>
+    <w:p>
+      <w:pPr>
+        <w:rPr>
+          <w:lang w:val="es-MX"/>
+        </w:rPr>
+      </w:pPr>
+    </w:p>
+    <w:p>
+      <w:pPr>
+        <w:rPr>
+          <w:lang w:val="es-MX"/>
+        </w:rPr>
+      </w:pPr>
+    </w:p>
+    <w:p>
+      <w:pPr>
+        <w:rPr>
+          <w:lang w:val="es-MX"/>
+        </w:rPr>
+      </w:pPr>
+    </w:p>
+    <w:p>
+      <w:pPr>
+        <w:rPr>
+          <w:lang w:val="es-MX"/>
+        </w:rPr>
+      </w:pPr>
+    </w:p>
+    <w:p>
+      <w:pPr>
+        <w:rPr>
+          <w:lang w:val="es-MX"/>
+        </w:rPr>
+      </w:pPr>
+    </w:p>
+    <w:p>
+      <w:pPr>
+        <w:rPr>
+          <w:lang w:val="es-MX"/>
+        </w:rPr>
+      </w:pPr>
+    </w:p>
+    <w:p>
+      <w:pPr>
+        <w:rPr>
+          <w:lang w:val="es-MX"/>
+        </w:rPr>
+      </w:pPr>
+    </w:p>
+    <w:p>
+      <w:pPr>
+        <w:rPr>
+          <w:lang w:val="es-MX"/>
+        </w:rPr>
+      </w:pPr>
+      <w:r>
+        <w:rPr>
+          <w:lang w:val="es-MX"/>
+        </w:rPr>
+        <w:lastRenderedPageBreak/>
+        <w:t>9.</w:t>
+      </w:r>
+    </w:p>
+    <w:p>
+      <w:pPr>
+        <w:rPr>
+          <w:lang w:val="es-MX"/>
+        </w:rPr>
+      </w:pPr>
+      <w:r>
+        <w:rPr>
+          <w:lang w:val="es-MX"/>
+        </w:rPr>
+        <w:drawing>
+          <wp:inline distT="0" distB="0" distL="0" distR="0" wp14:anchorId="1F84BE39" wp14:editId="4282569E">
+            <wp:extent cx="3886742" cy="2286319"/>
+            <wp:effectExtent l="0" t="0" r="0" b="0"/>
+            <wp:docPr id="1818694996" name="Imagen 1"/>
+            <wp:cNvGraphicFramePr>
+              <a:graphicFrameLocks xmlns:a="http://schemas.openxmlformats.org/drawingml/2006/main" noChangeAspect="1"/>
+            </wp:cNvGraphicFramePr>
+            <a:graphic xmlns:a="http://schemas.openxmlformats.org/drawingml/2006/main">
+              <a:graphicData uri="http://schemas.openxmlformats.org/drawingml/2006/picture">
+                <pic:pic xmlns:pic="http://schemas.openxmlformats.org/drawingml/2006/picture">
+                  <pic:nvPicPr>
+                    <pic:cNvPr id="1818694996" name=""/>
+                    <pic:cNvPicPr/>
+                  </pic:nvPicPr>
+                  <pic:blipFill>
+                    <a:blip r:embed="rId20"/>
+                    <a:stretch>
+                      <a:fillRect/>
+                    </a:stretch>
+                  </pic:blipFill>
+                  <pic:spPr>
+                    <a:xfrm>
+                      <a:off x="0" y="0"/>
+                      <a:ext cx="3886742" cy="2286319"/>
+                    </a:xfrm>
+                    <a:prstGeom prst="rect">
+                      <a:avLst/>
+                    </a:prstGeom>
+                  </pic:spPr>
+                </pic:pic>
+              </a:graphicData>
+            </a:graphic>
+          </wp:inline>
+        </w:drawing>
+      </w:r>
+    </w:p>
+    <w:p>
+      <w:pPr>
+        <w:rPr>
+          <w:lang w:val="es-MX"/>
+        </w:rPr>
+      </w:pPr>
+      <w:r>
+        <w:rPr>
+          <w:lang w:val="es-MX"/>
+        </w:rPr>
+        <w:drawing>
+          <wp:inline distT="0" distB="0" distL="0" distR="0" wp14:anchorId="2FBF3585" wp14:editId="2494FC87">
+            <wp:extent cx="5612130" cy="1195070"/>
+            <wp:effectExtent l="0" t="0" r="7620" b="5080"/>
+            <wp:docPr id="425078886" name="Imagen 1"/>
+            <wp:cNvGraphicFramePr>
+              <a:graphicFrameLocks xmlns:a="http://schemas.openxmlformats.org/drawingml/2006/main" noChangeAspect="1"/>
+            </wp:cNvGraphicFramePr>
+            <a:graphic xmlns:a="http://schemas.openxmlformats.org/drawingml/2006/main">
+              <a:graphicData uri="http://schemas.openxmlformats.org/drawingml/2006/picture">
+                <pic:pic xmlns:pic="http://schemas.openxmlformats.org/drawingml/2006/picture">
+                  <pic:nvPicPr>
+                    <pic:cNvPr id="425078886" name=""/>
+                    <pic:cNvPicPr/>
+                  </pic:nvPicPr>
+                  <pic:blipFill>
+                    <a:blip r:embed="rId21"/>
+                    <a:stretch>
+                      <a:fillRect/>
+                    </a:stretch>
+                  </pic:blipFill>
+                  <pic:spPr>
+                    <a:xfrm>
+                      <a:off x="0" y="0"/>
+                      <a:ext cx="5612130" cy="1195070"/>
+                    </a:xfrm>
+                    <a:prstGeom prst="rect">
+                      <a:avLst/>
+                    </a:prstGeom>
+                  </pic:spPr>
+                </pic:pic>
+              </a:graphicData>
+            </a:graphic>
+          </wp:inline>
+        </w:drawing>
+      </w:r>
+    </w:p>
+    <w:p>
+      <w:pPr>
+        <w:rPr>
+          <w:lang w:val="es-MX"/>
+        </w:rPr>
+      </w:pPr>
+      <w:r>
+        <w:rPr>
+          <w:lang w:val="es-MX"/>
+        </w:rPr>
+        <w:t>10.</w:t>
+      </w:r>
+    </w:p>
+    <w:p>
+      <w:pPr>
+        <w:rPr>
+          <w:lang w:val="es-MX"/>
+        </w:rPr>
+      </w:pPr>
+      <w:r>
+        <w:rPr>
+          <w:lang w:val="es-MX"/>
+        </w:rPr>
+        <w:drawing>
+          <wp:inline distT="0" distB="0" distL="0" distR="0" wp14:anchorId="211593BD" wp14:editId="53D18171">
+            <wp:extent cx="4163006" cy="1981477"/>
+            <wp:effectExtent l="0" t="0" r="0" b="0"/>
+            <wp:docPr id="1178720271" name="Imagen 1"/>
+            <wp:cNvGraphicFramePr>
+              <a:graphicFrameLocks xmlns:a="http://schemas.openxmlformats.org/drawingml/2006/main" noChangeAspect="1"/>
+            </wp:cNvGraphicFramePr>
+            <a:graphic xmlns:a="http://schemas.openxmlformats.org/drawingml/2006/main">
+              <a:graphicData uri="http://schemas.openxmlformats.org/drawingml/2006/picture">
+                <pic:pic xmlns:pic="http://schemas.openxmlformats.org/drawingml/2006/picture">
+                  <pic:nvPicPr>
+                    <pic:cNvPr id="1178720271" name=""/>
+                    <pic:cNvPicPr/>
+                  </pic:nvPicPr>
+                  <pic:blipFill>
+                    <a:blip r:embed="rId22"/>
+                    <a:stretch>
+                      <a:fillRect/>
+                    </a:stretch>
+                  </pic:blipFill>
+                  <pic:spPr>
+                    <a:xfrm>
+                      <a:off x="0" y="0"/>
+                      <a:ext cx="4163006" cy="1981477"/>
+                    </a:xfrm>
+                    <a:prstGeom prst="rect">
+                      <a:avLst/>
+                    </a:prstGeom>
+                  </pic:spPr>
+                </pic:pic>
+              </a:graphicData>
+            </a:graphic>
+          </wp:inline>
+        </w:drawing>
+      </w:r>
+    </w:p>
+    <w:p>
+      <w:pPr>
+        <w:rPr>
+          <w:lang w:val="es-MX"/>
+        </w:rPr>
+      </w:pPr>
+      <w:r>
+        <w:rPr>
+          <w:lang w:val="es-MX"/>
+        </w:rPr>
+        <w:drawing>
+          <wp:inline distT="0" distB="0" distL="0" distR="0" wp14:anchorId="3391819D" wp14:editId="7759C21E">
+            <wp:extent cx="5612130" cy="739140"/>
+            <wp:effectExtent l="0" t="0" r="7620" b="3810"/>
+            <wp:docPr id="550052626" name="Imagen 1"/>
+            <wp:cNvGraphicFramePr>
+              <a:graphicFrameLocks xmlns:a="http://schemas.openxmlformats.org/drawingml/2006/main" noChangeAspect="1"/>
+            </wp:cNvGraphicFramePr>
+            <a:graphic xmlns:a="http://schemas.openxmlformats.org/drawingml/2006/main">
+              <a:graphicData uri="http://schemas.openxmlformats.org/drawingml/2006/picture">
+                <pic:pic xmlns:pic="http://schemas.openxmlformats.org/drawingml/2006/picture">
+                  <pic:nvPicPr>
+                    <pic:cNvPr id="550052626" name=""/>
+                    <pic:cNvPicPr/>
+                  </pic:nvPicPr>
+                  <pic:blipFill>
+                    <a:blip r:embed="rId23"/>
+                    <a:stretch>
+                      <a:fillRect/>
+                    </a:stretch>
+                  </pic:blipFill>
+                  <pic:spPr>
+                    <a:xfrm>
+                      <a:off x="0" y="0"/>
+                      <a:ext cx="5612130" cy="739140"/>
+                    </a:xfrm>
+                    <a:prstGeom prst="rect">
+                      <a:avLst/>
+                    </a:prstGeom>
+                  </pic:spPr>
+                </pic:pic>
+              </a:graphicData>
+            </a:graphic>
+          </wp:inline>
+        </w:drawing>
+      </w:r>
+    </w:p>
+    <w:p>
+      <w:pPr>
+        <w:rPr>
+          <w:lang w:val="es-MX"/>
+        </w:rPr>
+      </w:pPr>
+    </w:p>
+    <w:p>
+      <w:pPr>
+        <w:rPr>
+          <w:lang w:val="es-MX"/>
+        </w:rPr>
+      </w:pPr>
+    </w:p>
+    <w:p>
+      <w:pPr>
+        <w:rPr>
+          <w:lang w:val="es-MX"/>
+        </w:rPr>
+      </w:pPr>
+    </w:p>
+    <w:p>
+      <w:pPr>
+        <w:rPr>
+          <w:lang w:val="es-MX"/>
+        </w:rPr>
+      </w:pPr>
+      <w:r>
+        <w:rPr>
+          <w:lang w:val="es-MX"/>
+        </w:rPr>
+        <w:lastRenderedPageBreak/>
+        <w:t>11.</w:t>
+      </w:r>
+    </w:p>
+    <w:p>
+      <w:pPr>
+        <w:rPr>
+          <w:lang w:val="es-MX"/>
+        </w:rPr>
+      </w:pPr>
+      <w:r>
+        <w:rPr>
+          <w:lang w:val="es-MX"/>
+        </w:rPr>
+        <w:drawing>
+          <wp:inline distT="0" distB="0" distL="0" distR="0" wp14:anchorId="26A77E36" wp14:editId="02A19CB6">
+            <wp:extent cx="4105848" cy="1867161"/>
+            <wp:effectExtent l="0" t="0" r="0" b="0"/>
+            <wp:docPr id="1634802843" name="Imagen 1"/>
+            <wp:cNvGraphicFramePr>
+              <a:graphicFrameLocks xmlns:a="http://schemas.openxmlformats.org/drawingml/2006/main" noChangeAspect="1"/>
+            </wp:cNvGraphicFramePr>
+            <a:graphic xmlns:a="http://schemas.openxmlformats.org/drawingml/2006/main">
+              <a:graphicData uri="http://schemas.openxmlformats.org/drawingml/2006/picture">
+                <pic:pic xmlns:pic="http://schemas.openxmlformats.org/drawingml/2006/picture">
+                  <pic:nvPicPr>
+                    <pic:cNvPr id="1634802843" name=""/>
+                    <pic:cNvPicPr/>
+                  </pic:nvPicPr>
+                  <pic:blipFill>
+                    <a:blip r:embed="rId24"/>
+                    <a:stretch>
+                      <a:fillRect/>
+                    </a:stretch>
+                  </pic:blipFill>
+                  <pic:spPr>
+                    <a:xfrm>
+                      <a:off x="0" y="0"/>
+                      <a:ext cx="4105848" cy="1867161"/>
+                    </a:xfrm>
+                    <a:prstGeom prst="rect">
+                      <a:avLst/>
+                    </a:prstGeom>
+                  </pic:spPr>
+                </pic:pic>
+              </a:graphicData>
+            </a:graphic>
+          </wp:inline>
+        </w:drawing>
+      </w:r>
+    </w:p>
+    <w:p>
+      <w:pPr>
+        <w:rPr>
+          <w:lang w:val="es-MX"/>
+        </w:rPr>
+      </w:pPr>
+      <w:r>
+        <w:rPr>
+          <w:lang w:val="es-MX"/>
+        </w:rPr>
+        <w:drawing>
+          <wp:inline distT="0" distB="0" distL="0" distR="0" wp14:anchorId="3A8F19A2" wp14:editId="15916F26">
+            <wp:extent cx="5612130" cy="784860"/>
+            <wp:effectExtent l="0" t="0" r="7620" b="0"/>
+            <wp:docPr id="160588019" name="Imagen 1"/>
+            <wp:cNvGraphicFramePr>
+              <a:graphicFrameLocks xmlns:a="http://schemas.openxmlformats.org/drawingml/2006/main" noChangeAspect="1"/>
+            </wp:cNvGraphicFramePr>
+            <a:graphic xmlns:a="http://schemas.openxmlformats.org/drawingml/2006/main">
+              <a:graphicData uri="http://schemas.openxmlformats.org/drawingml/2006/picture">
+                <pic:pic xmlns:pic="http://schemas.openxmlformats.org/drawingml/2006/picture">
+                  <pic:nvPicPr>
+                    <pic:cNvPr id="160588019" name=""/>
+                    <pic:cNvPicPr/>
+                  </pic:nvPicPr>
+                  <pic:blipFill>
+                    <a:blip r:embed="rId25"/>
+                    <a:stretch>
+                      <a:fillRect/>
+                    </a:stretch>
+                  </pic:blipFill>
+                  <pic:spPr>
+                    <a:xfrm>
+                      <a:off x="0" y="0"/>
+                      <a:ext cx="5612130" cy="784860"/>
+                    </a:xfrm>
+                    <a:prstGeom prst="rect">
+                      <a:avLst/>
+                    </a:prstGeom>
+                  </pic:spPr>
+                </pic:pic>
+              </a:graphicData>
+            </a:graphic>
+          </wp:inline>
+        </w:drawing>
+      </w:r>
+    </w:p>
+    <w:p>
+      <w:pPr>
+        <w:rPr>
+          <w:lang w:val="es-MX"/>
+        </w:rPr>
+      </w:pPr>
+      <w:r>
+        <w:rPr>
+          <w:lang w:val="es-MX"/>
+        </w:rPr>
+        <w:t>12.</w:t>
+      </w:r>
+    </w:p>
+    <w:p>
+      <w:pPr>
+        <w:rPr>
+          <w:lang w:val="es-MX"/>
+        </w:rPr>
+      </w:pPr>
+      <w:r>
+        <w:rPr>
+          <w:lang w:val="es-MX"/>
+        </w:rPr>
+        <w:drawing>
+          <wp:inline distT="0" distB="0" distL="0" distR="0" wp14:anchorId="281AE1C8" wp14:editId="2A54903F">
+            <wp:extent cx="4944165" cy="1952898"/>
+            <wp:effectExtent l="0" t="0" r="0" b="9525"/>
+            <wp:docPr id="82926509" name="Imagen 1"/>
+            <wp:cNvGraphicFramePr>
+              <a:graphicFrameLocks xmlns:a="http://schemas.openxmlformats.org/drawingml/2006/main" noChangeAspect="1"/>
+            </wp:cNvGraphicFramePr>
+            <a:graphic xmlns:a="http://schemas.openxmlformats.org/drawingml/2006/main">
+              <a:graphicData uri="http://schemas.openxmlformats.org/drawingml/2006/picture">
+                <pic:pic xmlns:pic="http://schemas.openxmlformats.org/drawingml/2006/picture">
+                  <pic:nvPicPr>
+                    <pic:cNvPr id="82926509" name=""/>
+                    <pic:cNvPicPr/>
+                  </pic:nvPicPr>
+                  <pic:blipFill>
+                    <a:blip r:embed="rId26"/>
+                    <a:stretch>
+                      <a:fillRect/>
+                    </a:stretch>
+                  </pic:blipFill>
+                  <pic:spPr>
+                    <a:xfrm>
+                      <a:off x="0" y="0"/>
+                      <a:ext cx="4944165" cy="1952898"/>
+                    </a:xfrm>
+                    <a:prstGeom prst="rect">
+                      <a:avLst/>
+                    </a:prstGeom>
+                  </pic:spPr>
+                </pic:pic>
+              </a:graphicData>
+            </a:graphic>
+          </wp:inline>
+        </w:drawing>
+      </w:r>
+    </w:p>
+    <w:p>
+      <w:pPr>
+        <w:rPr>
+          <w:lang w:val="es-MX"/>
+        </w:rPr>
+      </w:pPr>
+      <w:r>
+        <w:rPr>
+          <w:lang w:val="es-MX"/>
+        </w:rPr>
+        <w:drawing>
+          <wp:inline distT="0" distB="0" distL="0" distR="0" wp14:anchorId="6FF57308" wp14:editId="5A730B71">
+            <wp:extent cx="5612130" cy="654685"/>
+            <wp:effectExtent l="0" t="0" r="7620" b="0"/>
+            <wp:docPr id="935655731" name="Imagen 1"/>
+            <wp:cNvGraphicFramePr>
+              <a:graphicFrameLocks xmlns:a="http://schemas.openxmlformats.org/drawingml/2006/main" noChangeAspect="1"/>
+            </wp:cNvGraphicFramePr>
+            <a:graphic xmlns:a="http://schemas.openxmlformats.org/drawingml/2006/main">
+              <a:graphicData uri="http://schemas.openxmlformats.org/drawingml/2006/picture">
+                <pic:pic xmlns:pic="http://schemas.openxmlformats.org/drawingml/2006/picture">
+                  <pic:nvPicPr>
+                    <pic:cNvPr id="935655731" name=""/>
+                    <pic:cNvPicPr/>
+                  </pic:nvPicPr>
+                  <pic:blipFill>
+                    <a:blip r:embed="rId27"/>
+                    <a:stretch>
+                      <a:fillRect/>
+                    </a:stretch>
+                  </pic:blipFill>
+                  <pic:spPr>
+                    <a:xfrm>
+                      <a:off x="0" y="0"/>
+                      <a:ext cx="5612130" cy="654685"/>
+                    </a:xfrm>
+                    <a:prstGeom prst="rect">
+                      <a:avLst/>
+                    </a:prstGeom>
+                  </pic:spPr>
+                </pic:pic>
+              </a:graphicData>
+            </a:graphic>
+          </wp:inline>
+        </w:drawing>
+      </w:r>
+    </w:p>
+    <w:p>
+      <w:pPr>
+        <w:rPr>
+          <w:lang w:val="es-MX"/>
+        </w:rPr>
+      </w:pPr>
+    </w:p>
+    <w:p>
+      <w:pPr>
+        <w:rPr>
+          <w:lang w:val="es-MX"/>
+        </w:rPr>
+      </w:pPr>
+    </w:p>
+    <w:p>
+      <w:pPr>
+        <w:rPr>
+          <w:lang w:val="es-MX"/>
+        </w:rPr>
+      </w:pPr>
+    </w:p>
+    <w:p>
+      <w:pPr>
+        <w:rPr>
+          <w:lang w:val="es-MX"/>
+        </w:rPr>
+      </w:pPr>
+    </w:p>
+    <w:p>
+      <w:pPr>
+        <w:rPr>
+          <w:lang w:val="es-MX"/>
+        </w:rPr>
+      </w:pPr>
+    </w:p>
+    <w:p>
+      <w:pPr>
+        <w:rPr>
+          <w:lang w:val="es-MX"/>
+        </w:rPr>
+      </w:pPr>
+    </w:p>
+    <w:p>
+      <w:pPr>
+        <w:rPr>
+          <w:lang w:val="es-MX"/>
+        </w:rPr>
+      </w:pPr>
+      <w:r>
+        <w:rPr>
+          <w:lang w:val="es-MX"/>
+        </w:rPr>
+        <w:lastRenderedPageBreak/>
+        <w:t>13.</w:t>
+      </w:r>
+    </w:p>
+    <w:p>
+      <w:pPr>
+        <w:rPr>
+          <w:lang w:val="es-MX"/>
+        </w:rPr>
+      </w:pPr>
+      <w:r>
+        <w:rPr>
+          <w:lang w:val="es-MX"/>
+        </w:rPr>
+        <w:drawing>
+          <wp:inline distT="0" distB="0" distL="0" distR="0" wp14:anchorId="50468C7E" wp14:editId="3D88AF71">
+            <wp:extent cx="4525006" cy="5125165"/>
+            <wp:effectExtent l="0" t="0" r="9525" b="0"/>
+            <wp:docPr id="1810006905" name="Imagen 1"/>
+            <wp:cNvGraphicFramePr>
+              <a:graphicFrameLocks xmlns:a="http://schemas.openxmlformats.org/drawingml/2006/main" noChangeAspect="1"/>
+            </wp:cNvGraphicFramePr>
+            <a:graphic xmlns:a="http://schemas.openxmlformats.org/drawingml/2006/main">
+              <a:graphicData uri="http://schemas.openxmlformats.org/drawingml/2006/picture">
+                <pic:pic xmlns:pic="http://schemas.openxmlformats.org/drawingml/2006/picture">
+                  <pic:nvPicPr>
+                    <pic:cNvPr id="1810006905" name=""/>
+                    <pic:cNvPicPr/>
+                  </pic:nvPicPr>
+                  <pic:blipFill>
+                    <a:blip r:embed="rId28"/>
+                    <a:stretch>
+                      <a:fillRect/>
+                    </a:stretch>
+                  </pic:blipFill>
+                  <pic:spPr>
+                    <a:xfrm>
+                      <a:off x="0" y="0"/>
+                      <a:ext cx="4525006" cy="5125165"/>
+                    </a:xfrm>
+                    <a:prstGeom prst="rect">
+                      <a:avLst/>
+                    </a:prstGeom>
+                  </pic:spPr>
+                </pic:pic>
+              </a:graphicData>
+            </a:graphic>
+          </wp:inline>
+        </w:drawing>
+      </w:r>
+    </w:p>
+    <w:p>
+      <w:pPr>
+        <w:rPr>
+          <w:lang w:val="es-MX"/>
+        </w:rPr>
+      </w:pPr>
+      <w:r>
+        <w:rPr>
+          <w:lang w:val="es-MX"/>
+        </w:rPr>
+        <w:drawing>
+          <wp:inline distT="0" distB="0" distL="0" distR="0" wp14:anchorId="5DB9B990" wp14:editId="4099B1E7">
+            <wp:extent cx="5612130" cy="1470025"/>
+            <wp:effectExtent l="0" t="0" r="7620" b="0"/>
+            <wp:docPr id="1483377298" name="Imagen 1"/>
+            <wp:cNvGraphicFramePr>
+              <a:graphicFrameLocks xmlns:a="http://schemas.openxmlformats.org/drawingml/2006/main" noChangeAspect="1"/>
+            </wp:cNvGraphicFramePr>
+            <a:graphic xmlns:a="http://schemas.openxmlformats.org/drawingml/2006/main">
+              <a:graphicData uri="http://schemas.openxmlformats.org/drawingml/2006/picture">
+                <pic:pic xmlns:pic="http://schemas.openxmlformats.org/drawingml/2006/picture">
+                  <pic:nvPicPr>
+                    <pic:cNvPr id="1483377298" name=""/>
+                    <pic:cNvPicPr/>
+                  </pic:nvPicPr>
+                  <pic:blipFill>
+                    <a:blip r:embed="rId29"/>
+                    <a:stretch>
+                      <a:fillRect/>
+                    </a:stretch>
+                  </pic:blipFill>
+                  <pic:spPr>
+                    <a:xfrm>
+                      <a:off x="0" y="0"/>
+                      <a:ext cx="5612130" cy="1470025"/>
+                    </a:xfrm>
+                    <a:prstGeom prst="rect">
+                      <a:avLst/>
+                    </a:prstGeom>
+                  </pic:spPr>
+                </pic:pic>
+              </a:graphicData>
+            </a:graphic>
+          </wp:inline>
+        </w:drawing>
+      </w:r>
+    </w:p>
+    <w:p>
+      <w:pPr>
+        <w:rPr>
+          <w:lang w:val="es-MX"/>
+        </w:rPr>
+      </w:pPr>
+    </w:p>
+    <w:p>
+      <w:pPr>
+        <w:rPr>
+          <w:lang w:val="es-MX"/>
+        </w:rPr>
+      </w:pPr>
+    </w:p>
+    <w:p>
+      <w:pPr>
+        <w:rPr>
+          <w:lang w:val="es-MX"/>
+        </w:rPr>
+      </w:pPr>
+    </w:p>
+    <w:p>
+      <w:pPr>
+        <w:rPr>
+          <w:lang w:val="es-MX"/>
+        </w:rPr>
+      </w:pPr>
+      <w:r>
+        <w:rPr>
+          <w:lang w:val="es-MX"/>
+        </w:rPr>
+        <w:lastRenderedPageBreak/>
+        <w:t>14.</w:t>
+      </w:r>
+    </w:p>
+    <w:p>
+      <w:pPr>
+        <w:rPr>
+          <w:lang w:val="es-MX"/>
+        </w:rPr>
+      </w:pPr>
+      <w:r>
+        <w:rPr>
+          <w:lang w:val="es-MX"/>
+        </w:rPr>
+        <w:drawing>
+          <wp:inline distT="0" distB="0" distL="0" distR="0" wp14:anchorId="2263CEA8" wp14:editId="69FBD201">
+            <wp:extent cx="4820323" cy="4305901"/>
+            <wp:effectExtent l="0" t="0" r="0" b="0"/>
+            <wp:docPr id="1637244588" name="Imagen 1"/>
+            <wp:cNvGraphicFramePr>
+              <a:graphicFrameLocks xmlns:a="http://schemas.openxmlformats.org/drawingml/2006/main" noChangeAspect="1"/>
+            </wp:cNvGraphicFramePr>
+            <a:graphic xmlns:a="http://schemas.openxmlformats.org/drawingml/2006/main">
+              <a:graphicData uri="http://schemas.openxmlformats.org/drawingml/2006/picture">
+                <pic:pic xmlns:pic="http://schemas.openxmlformats.org/drawingml/2006/picture">
+                  <pic:nvPicPr>
+                    <pic:cNvPr id="1637244588" name=""/>
+                    <pic:cNvPicPr/>
+                  </pic:nvPicPr>
+                  <pic:blipFill>
+                    <a:blip r:embed="rId30"/>
+                    <a:stretch>
+                      <a:fillRect/>
+                    </a:stretch>
+                  </pic:blipFill>
+                  <pic:spPr>
+                    <a:xfrm>
+                      <a:off x="0" y="0"/>
+                      <a:ext cx="4820323" cy="4305901"/>
+                    </a:xfrm>
+                    <a:prstGeom prst="rect">
+                      <a:avLst/>
+                    </a:prstGeom>
+                  </pic:spPr>
+                </pic:pic>
+              </a:graphicData>
+            </a:graphic>
+          </wp:inline>
+        </w:drawing>
+      </w:r>
+    </w:p>
+    <w:p>
+      <w:pPr>
+        <w:rPr>
+          <w:lang w:val="es-MX"/>
+        </w:rPr>
+      </w:pPr>
+      <w:r>
+        <w:rPr>
+          <w:lang w:val="es-MX"/>
+        </w:rPr>
+        <w:drawing>
+          <wp:inline distT="0" distB="0" distL="0" distR="0" wp14:anchorId="61A0B7D6" wp14:editId="7A406451">
+            <wp:extent cx="5612130" cy="1864360"/>
+            <wp:effectExtent l="0" t="0" r="7620" b="2540"/>
+            <wp:docPr id="439699090" name="Imagen 1"/>
+            <wp:cNvGraphicFramePr>
+              <a:graphicFrameLocks xmlns:a="http://schemas.openxmlformats.org/drawingml/2006/main" noChangeAspect="1"/>
+            </wp:cNvGraphicFramePr>
+            <a:graphic xmlns:a="http://schemas.openxmlformats.org/drawingml/2006/main">
+              <a:graphicData uri="http://schemas.openxmlformats.org/drawingml/2006/picture">
+                <pic:pic xmlns:pic="http://schemas.openxmlformats.org/drawingml/2006/picture">
+                  <pic:nvPicPr>
+                    <pic:cNvPr id="439699090" name=""/>
+                    <pic:cNvPicPr/>
+                  </pic:nvPicPr>
+                  <pic:blipFill>
+                    <a:blip r:embed="rId31"/>
+                    <a:stretch>
+                      <a:fillRect/>
+                    </a:stretch>
+                  </pic:blipFill>
+                  <pic:spPr>
+                    <a:xfrm>
+                      <a:off x="0" y="0"/>
+                      <a:ext cx="5612130" cy="1864360"/>
+                    </a:xfrm>
+                    <a:prstGeom prst="rect">
+                      <a:avLst/>
+                    </a:prstGeom>
+                  </pic:spPr>
+                </pic:pic>
+              </a:graphicData>
+            </a:graphic>
+          </wp:inline>
+        </w:drawing>
+      </w:r>
+    </w:p>
+    <w:p>
+      <w:pPr>
+        <w:rPr>
+          <w:lang w:val="es-MX"/>
+        </w:rPr>
+      </w:pPr>
+    </w:p>
+    <w:p>
+      <w:pPr>
+        <w:rPr>
+          <w:lang w:val="es-MX"/>
+        </w:rPr>
+      </w:pPr>
+    </w:p>
+    <w:p>
+      <w:pPr>
+        <w:rPr>
+          <w:lang w:val="es-MX"/>
+        </w:rPr>
+      </w:pPr>
+    </w:p>
+    <w:p>
+      <w:pPr>
+        <w:rPr>
+          <w:lang w:val="es-MX"/>
+        </w:rPr>
+      </w:pPr>
+    </w:p>
+    <w:p>
+      <w:pPr>
+        <w:rPr>
+          <w:lang w:val="es-MX"/>
+        </w:rPr>
+      </w:pPr>
+    </w:p>
+    <w:p>
+      <w:pPr>
+        <w:rPr>
+          <w:lang w:val="es-MX"/>
+        </w:rPr>
+      </w:pPr>
+      <w:r>
+        <w:rPr>
+          <w:lang w:val="es-MX"/>
+        </w:rPr>
+        <w:lastRenderedPageBreak/>
+        <w:t>15.</w:t>
+      </w:r>
+    </w:p>
+    <w:p>
+      <w:pPr>
+        <w:rPr>
+          <w:lang w:val="es-MX"/>
+        </w:rPr>
+      </w:pPr>
+      <w:r>
+        <w:rPr>
+          <w:lang w:val="es-MX"/>
+        </w:rPr>
+        <w:drawing>
+          <wp:inline distT="0" distB="0" distL="0" distR="0" wp14:anchorId="18E83B16" wp14:editId="202F8459">
+            <wp:extent cx="3477110" cy="4239217"/>
+            <wp:effectExtent l="0" t="0" r="0" b="9525"/>
+            <wp:docPr id="1769582080" name="Imagen 1"/>
+            <wp:cNvGraphicFramePr>
+              <a:graphicFrameLocks xmlns:a="http://schemas.openxmlformats.org/drawingml/2006/main" noChangeAspect="1"/>
+            </wp:cNvGraphicFramePr>
+            <a:graphic xmlns:a="http://schemas.openxmlformats.org/drawingml/2006/main">
+              <a:graphicData uri="http://schemas.openxmlformats.org/drawingml/2006/picture">
+                <pic:pic xmlns:pic="http://schemas.openxmlformats.org/drawingml/2006/picture">
+                  <pic:nvPicPr>
+                    <pic:cNvPr id="1769582080" name=""/>
+                    <pic:cNvPicPr/>
+                  </pic:nvPicPr>
+                  <pic:blipFill>
+                    <a:blip r:embed="rId32"/>
+                    <a:stretch>
+                      <a:fillRect/>
+                    </a:stretch>
+                  </pic:blipFill>
+                  <pic:spPr>
+                    <a:xfrm>
+                      <a:off x="0" y="0"/>
+                      <a:ext cx="3477110" cy="4239217"/>
+                    </a:xfrm>
+                    <a:prstGeom prst="rect">
+                      <a:avLst/>
+                    </a:prstGeom>
+                  </pic:spPr>
+                </pic:pic>
+              </a:graphicData>
+            </a:graphic>
+          </wp:inline>
+        </w:drawing>
+      </w:r>
+    </w:p>
+    <w:p>
+      <w:pPr>
+        <w:rPr>
+          <w:lang w:val="es-MX"/>
+        </w:rPr>
+      </w:pPr>
+      <w:r>
+        <w:rPr>
+          <w:lang w:val="es-MX"/>
+        </w:rPr>
+        <w:drawing>
+          <wp:inline distT="0" distB="0" distL="0" distR="0" wp14:anchorId="7E3C236F" wp14:editId="5BDAD9BE">
+            <wp:extent cx="5612130" cy="1925955"/>
+            <wp:effectExtent l="0" t="0" r="7620" b="0"/>
+            <wp:docPr id="98046055" name="Imagen 1"/>
+            <wp:cNvGraphicFramePr>
+              <a:graphicFrameLocks xmlns:a="http://schemas.openxmlformats.org/drawingml/2006/main" noChangeAspect="1"/>
+            </wp:cNvGraphicFramePr>
+            <a:graphic xmlns:a="http://schemas.openxmlformats.org/drawingml/2006/main">
+              <a:graphicData uri="http://schemas.openxmlformats.org/drawingml/2006/picture">
+                <pic:pic xmlns:pic="http://schemas.openxmlformats.org/drawingml/2006/picture">
+                  <pic:nvPicPr>
+                    <pic:cNvPr id="98046055" name=""/>
+                    <pic:cNvPicPr/>
+                  </pic:nvPicPr>
+                  <pic:blipFill>
+                    <a:blip r:embed="rId33"/>
+                    <a:stretch>
+                      <a:fillRect/>
+                    </a:stretch>
+                  </pic:blipFill>
+                  <pic:spPr>
+                    <a:xfrm>
+                      <a:off x="0" y="0"/>
+                      <a:ext cx="5612130" cy="1925955"/>
+                    </a:xfrm>
+                    <a:prstGeom prst="rect">
+                      <a:avLst/>
+                    </a:prstGeom>
+                  </pic:spPr>
+                </pic:pic>
+              </a:graphicData>
+            </a:graphic>
+          </wp:inline>
+        </w:drawing>
+      </w:r>
+    </w:p>
+    <w:p>
+      <w:pPr>
+        <w:rPr>
+          <w:lang w:val="es-MX"/>
+        </w:rPr>
+      </w:pPr>
+    </w:p>
+    <w:p>
+      <w:pPr>
+        <w:rPr>
+          <w:lang w:val="es-MX"/>
+        </w:rPr>
+      </w:pPr>
+    </w:p>
+    <w:p>
+      <w:pPr>
+        <w:rPr>
+          <w:lang w:val="es-MX"/>
+        </w:rPr>
+      </w:pPr>
+    </w:p>
+    <w:p>
+      <w:pPr>
+        <w:rPr>
+          <w:lang w:val="es-MX"/>
+        </w:rPr>
+      </w:pPr>
+    </w:p>
+    <w:p>
+      <w:pPr>
+        <w:rPr>
+          <w:lang w:val="es-MX"/>
+        </w:rPr>
+      </w:pPr>
+    </w:p>
+    <w:p>
+      <w:pPr>
+        <w:rPr>
+          <w:lang w:val="es-MX"/>
+        </w:rPr>
+      </w:pPr>
+      <w:r>
+        <w:rPr>
+          <w:lang w:val="es-MX"/>
+        </w:rPr>
+        <w:lastRenderedPageBreak/>
+        <w:t>16.</w:t>
+      </w:r>
+    </w:p>
+    <w:p>
+      <w:pPr>
+        <w:rPr>
+          <w:lang w:val="es-MX"/>
+        </w:rPr>
+      </w:pPr>
+      <w:r>
+        <w:rPr>
+          <w:lang w:val="es-MX"/>
+        </w:rPr>
+        <w:drawing>
+          <wp:inline distT="0" distB="0" distL="0" distR="0" wp14:anchorId="652A9C5B" wp14:editId="2EBD332A">
+            <wp:extent cx="4467849" cy="4601217"/>
+            <wp:effectExtent l="0" t="0" r="9525" b="0"/>
+            <wp:docPr id="1475750242" name="Imagen 1"/>
+            <wp:cNvGraphicFramePr>
+              <a:graphicFrameLocks xmlns:a="http://schemas.openxmlformats.org/drawingml/2006/main" noChangeAspect="1"/>
+            </wp:cNvGraphicFramePr>
+            <a:graphic xmlns:a="http://schemas.openxmlformats.org/drawingml/2006/main">
+              <a:graphicData uri="http://schemas.openxmlformats.org/drawingml/2006/picture">
+                <pic:pic xmlns:pic="http://schemas.openxmlformats.org/drawingml/2006/picture">
+                  <pic:nvPicPr>
+                    <pic:cNvPr id="1475750242" name=""/>
+                    <pic:cNvPicPr/>
+                  </pic:nvPicPr>
+                  <pic:blipFill>
+                    <a:blip r:embed="rId34"/>
+                    <a:stretch>
+                      <a:fillRect/>
+                    </a:stretch>
+                  </pic:blipFill>
+                  <pic:spPr>
+                    <a:xfrm>
+                      <a:off x="0" y="0"/>
+                      <a:ext cx="4467849" cy="4601217"/>
+                    </a:xfrm>
+                    <a:prstGeom prst="rect">
+                      <a:avLst/>
+                    </a:prstGeom>
+                  </pic:spPr>
+                </pic:pic>
+              </a:graphicData>
+            </a:graphic>
+          </wp:inline>
+        </w:drawing>
+      </w:r>
+    </w:p>
+    <w:p>
+      <w:pPr>
+        <w:rPr>
+          <w:lang w:val="es-MX"/>
+        </w:rPr>
+      </w:pPr>
+      <w:r>
+        <w:rPr>
+          <w:lang w:val="es-MX"/>
+        </w:rPr>
+        <w:drawing>
+          <wp:inline distT="0" distB="0" distL="0" distR="0" wp14:anchorId="0B5E0856" wp14:editId="317281A4">
+            <wp:extent cx="3581900" cy="2229161"/>
+            <wp:effectExtent l="0" t="0" r="0" b="0"/>
+            <wp:docPr id="1967495737" name="Imagen 1"/>
+            <wp:cNvGraphicFramePr>
+              <a:graphicFrameLocks xmlns:a="http://schemas.openxmlformats.org/drawingml/2006/main" noChangeAspect="1"/>
+            </wp:cNvGraphicFramePr>
+            <a:graphic xmlns:a="http://schemas.openxmlformats.org/drawingml/2006/main">
+              <a:graphicData uri="http://schemas.openxmlformats.org/drawingml/2006/picture">
+                <pic:pic xmlns:pic="http://schemas.openxmlformats.org/drawingml/2006/picture">
+                  <pic:nvPicPr>
+                    <pic:cNvPr id="1967495737" name=""/>
+                    <pic:cNvPicPr/>
+                  </pic:nvPicPr>
+                  <pic:blipFill>
+                    <a:blip r:embed="rId35"/>
+                    <a:stretch>
+                      <a:fillRect/>
+                    </a:stretch>
+                  </pic:blipFill>
+                  <pic:spPr>
+                    <a:xfrm>
+                      <a:off x="0" y="0"/>
+                      <a:ext cx="3581900" cy="2229161"/>
+                    </a:xfrm>
+                    <a:prstGeom prst="rect">
+                      <a:avLst/>
+                    </a:prstGeom>
+                  </pic:spPr>
+                </pic:pic>
+              </a:graphicData>
+            </a:graphic>
+          </wp:inline>
+        </w:drawing>
+      </w:r>
+    </w:p>
+    <w:p>
+      <w:pPr>
+        <w:rPr>
+          <w:lang w:val="es-MX"/>
+        </w:rPr>
+      </w:pPr>
+    </w:p>
+    <w:p>
+      <w:pPr>
+        <w:rPr>
+          <w:lang w:val="es-MX"/>
+        </w:rPr>
+      </w:pPr>
+    </w:p>
+    <w:p>
+      <w:pPr>
+        <w:rPr>
+          <w:lang w:val="es-MX"/>
+        </w:rPr>
+      </w:pPr>
+    </w:p>
+    <w:p>
+      <w:pPr>
+        <w:rPr>
+          <w:lang w:val="es-MX"/>
+        </w:rPr>
+      </w:pPr>
+      <w:r>
+        <w:rPr>
+          <w:lang w:val="es-MX"/>
+        </w:rPr>
+        <w:lastRenderedPageBreak/>
+        <w:t>17.</w:t>
+      </w:r>
+    </w:p>
+    <w:p>
+      <w:pPr>
+        <w:rPr>
+          <w:lang w:val="es-MX"/>
+        </w:rPr>
+      </w:pPr>
+      <w:r>
+        <w:rPr>
+          <w:lang w:val="es-MX"/>
+        </w:rPr>
+        <w:drawing>
+          <wp:inline distT="0" distB="0" distL="0" distR="0" wp14:anchorId="46B8224C" wp14:editId="21089B46">
+            <wp:extent cx="3200847" cy="4591691"/>
+            <wp:effectExtent l="0" t="0" r="0" b="0"/>
+            <wp:docPr id="598009962" name="Imagen 1"/>
+            <wp:cNvGraphicFramePr>
+              <a:graphicFrameLocks xmlns:a="http://schemas.openxmlformats.org/drawingml/2006/main" noChangeAspect="1"/>
+            </wp:cNvGraphicFramePr>
+            <a:graphic xmlns:a="http://schemas.openxmlformats.org/drawingml/2006/main">
+              <a:graphicData uri="http://schemas.openxmlformats.org/drawingml/2006/picture">
+                <pic:pic xmlns:pic="http://schemas.openxmlformats.org/drawingml/2006/picture">
+                  <pic:nvPicPr>
+                    <pic:cNvPr id="598009962" name=""/>
+                    <pic:cNvPicPr/>
+                  </pic:nvPicPr>
+                  <pic:blipFill>
+                    <a:blip r:embed="rId36"/>
+                    <a:stretch>
+                      <a:fillRect/>
+                    </a:stretch>
+                  </pic:blipFill>
+                  <pic:spPr>
+                    <a:xfrm>
+                      <a:off x="0" y="0"/>
+                      <a:ext cx="3200847" cy="4591691"/>
+                    </a:xfrm>
+                    <a:prstGeom prst="rect">
+                      <a:avLst/>
+                    </a:prstGeom>
+                  </pic:spPr>
+                </pic:pic>
+              </a:graphicData>
+            </a:graphic>
+          </wp:inline>
+        </w:drawing>
+      </w:r>
+    </w:p>
+    <w:p>
+      <w:pPr>
+        <w:rPr>
+          <w:lang w:val="es-MX"/>
+        </w:rPr>
+      </w:pPr>
+      <w:r>
+        <w:rPr>
+          <w:lang w:val="es-MX"/>
+        </w:rPr>
+        <w:drawing>
+          <wp:inline distT="0" distB="0" distL="0" distR="0" wp14:anchorId="7F990326" wp14:editId="2C1ACA22">
+            <wp:extent cx="3324689" cy="2124371"/>
+            <wp:effectExtent l="0" t="0" r="9525" b="9525"/>
+            <wp:docPr id="9495574" name="Imagen 1"/>
+            <wp:cNvGraphicFramePr>
+              <a:graphicFrameLocks xmlns:a="http://schemas.openxmlformats.org/drawingml/2006/main" noChangeAspect="1"/>
+            </wp:cNvGraphicFramePr>
+            <a:graphic xmlns:a="http://schemas.openxmlformats.org/drawingml/2006/main">
+              <a:graphicData uri="http://schemas.openxmlformats.org/drawingml/2006/picture">
+                <pic:pic xmlns:pic="http://schemas.openxmlformats.org/drawingml/2006/picture">
+                  <pic:nvPicPr>
+                    <pic:cNvPr id="9495574" name=""/>
+                    <pic:cNvPicPr/>
+                  </pic:nvPicPr>
+                  <pic:blipFill>
+                    <a:blip r:embed="rId37"/>
+                    <a:stretch>
+                      <a:fillRect/>
+                    </a:stretch>
+                  </pic:blipFill>
+                  <pic:spPr>
+                    <a:xfrm>
+                      <a:off x="0" y="0"/>
+                      <a:ext cx="3324689" cy="2124371"/>
+                    </a:xfrm>
+                    <a:prstGeom prst="rect">
+                      <a:avLst/>
+                    </a:prstGeom>
+                  </pic:spPr>
+                </pic:pic>
+              </a:graphicData>
+            </a:graphic>
+          </wp:inline>
+        </w:drawing>
+      </w:r>
+    </w:p>
+    <w:p>
+      <w:pPr>
+        <w:rPr>
+          <w:lang w:val="es-MX"/>
+        </w:rPr>
+      </w:pPr>
     </w:p>
     <w:sectPr>
       <w:pgSz w:w="12240" w:h="15840"/>
@@ -1581,6 +2782,7 @@
   <w:style w:type="character" w:default="1" w:styleId="Fuentedeprrafopredeter">
     <w:name w:val="Default Paragraph Font"/>
     <w:uiPriority w:val="1"/>
+    <w:semiHidden/>
     <w:unhideWhenUsed/>
   </w:style>
   <w:style w:type="table" w:default="1" w:styleId="Tablanormal">

</xml_diff>